<commit_message>
docs: actualizar informe Word y evidencias con datos reales del equipo
Co-Authored-By: Claude Sonnet 5 <noreply@anthropic.com>
</commit_message>
<xml_diff>
--- a/docs/Implementacion_Control_Versiones_Equipo01.docx
+++ b/docs/Implementacion_Control_Versiones_Equipo01.docx
@@ -38,7 +38,7 @@
     </w:p>
     <w:p>
       <w:r>
-        <w:t>Una pequeña empresa necesita desarrollar una aplicación para registrar y consultar pedidos de sus clientes. Actualmente, el equipo de desarrollo intercambia archivos por correo electrónico y aplicaciones de mensajería, lo que ha generado múltiples problemas: coexistencia de distintas versiones del mismo código, cambios sobrescritos entre desarrolladores, imposibilidad de identificar quién realizó cada cambio, dificultad para regresar a una versión anterior ante un error, y modificaciones simultáneas sobre un mismo archivo por parte de varios desarrolladores.</w:t>
+        <w:t>Una empresa de Servicios Turísticos Norte Azul necesita desarrollar una aplicación para registrar y consultar pedidos de sus clientes. Actualmente, el equipo de desarrollo intercambia archivos por correo electrónico y aplicaciones de mensajería, lo que ha generado múltiples problemas: coexistencia de distintas versiones del mismo código, cambios sobrescritos entre desarrolladores, imposibilidad de identificar quién realizó cada cambio, dificultad para regresar a una versión anterior ante un error, y modificaciones simultáneas sobre un mismo archivo por parte de varios desarrolladores.</w:t>
       </w:r>
     </w:p>
     <w:p>
@@ -221,12 +221,7 @@
     </w:p>
     <w:p>
       <w:r>
-        <w:t>Repositorio remoto sugerido en GitHub: https://github.com/&lt;usuario-o-equipo&gt;/proyecto-pedidos-equipo01</w:t>
-      </w:r>
-    </w:p>
-    <w:p>
-      <w:r>
-        <w:t>Nota: reemplazar el enlace anterior por la URL real una vez creado el repositorio remoto y realizado el primer push (ver sección 9, pasos para el compañero de equipo).</w:t>
+        <w:t>Repositorio remoto en GitHub: https://github.com/U23208480/proyecto-pedidos-equipo01</w:t>
       </w:r>
     </w:p>
     <w:p>
@@ -397,6 +392,60 @@
               <w:t>* main</w:t>
             </w:r>
           </w:p>
+          <w:p>
+            <w:r>
+              <w:rPr>
+                <w:rFonts w:ascii="Consolas" w:hAnsi="Consolas"/>
+                <w:sz w:val="18"/>
+              </w:rPr>
+              <w:t xml:space="preserve">  remotes/origin/HEAD -&gt; origin/main</w:t>
+            </w:r>
+          </w:p>
+          <w:p>
+            <w:r>
+              <w:rPr>
+                <w:rFonts w:ascii="Consolas" w:hAnsi="Consolas"/>
+                <w:sz w:val="18"/>
+              </w:rPr>
+              <w:t xml:space="preserve">  remotes/origin/develop</w:t>
+            </w:r>
+          </w:p>
+          <w:p>
+            <w:r>
+              <w:rPr>
+                <w:rFonts w:ascii="Consolas" w:hAnsi="Consolas"/>
+                <w:sz w:val="18"/>
+              </w:rPr>
+              <w:t xml:space="preserve">  remotes/origin/feature/clientes</w:t>
+            </w:r>
+          </w:p>
+          <w:p>
+            <w:r>
+              <w:rPr>
+                <w:rFonts w:ascii="Consolas" w:hAnsi="Consolas"/>
+                <w:sz w:val="18"/>
+              </w:rPr>
+              <w:t xml:space="preserve">  remotes/origin/feature/pedidos</w:t>
+            </w:r>
+          </w:p>
+          <w:p>
+            <w:r>
+              <w:rPr>
+                <w:rFonts w:ascii="Consolas" w:hAnsi="Consolas"/>
+                <w:sz w:val="18"/>
+              </w:rPr>
+              <w:t xml:space="preserve">  remotes/origin/feature/productos</w:t>
+            </w:r>
+          </w:p>
+          <w:p>
+            <w:r>
+              <w:rPr>
+                <w:rFonts w:ascii="Consolas" w:hAnsi="Consolas"/>
+                <w:sz w:val="18"/>
+              </w:rPr>
+              <w:t xml:space="preserve">  remotes/origin/main</w:t>
+            </w:r>
+          </w:p>
         </w:tc>
       </w:tr>
     </w:tbl>
@@ -489,7 +538,7 @@
                 <w:rFonts w:ascii="Consolas" w:hAnsi="Consolas"/>
                 <w:sz w:val="18"/>
               </w:rPr>
-              <w:t>*   ec327f3 merge: integrar documentación de evidencias en main</w:t>
+              <w:t>*   ab73ba0 merge: integrar datos reales de integrantes y descripción del proyecto</w:t>
             </w:r>
           </w:p>
           <w:p>
@@ -499,6 +548,60 @@
                 <w:sz w:val="18"/>
               </w:rPr>
               <w:t xml:space="preserve">|\  </w:t>
+            </w:r>
+          </w:p>
+          <w:p>
+            <w:r>
+              <w:rPr>
+                <w:rFonts w:ascii="Consolas" w:hAnsi="Consolas"/>
+                <w:sz w:val="18"/>
+              </w:rPr>
+              <w:t>| * ba86ec1 docs: actualizar integrantes reales y descripción del proyecto</w:t>
+            </w:r>
+          </w:p>
+          <w:p>
+            <w:r>
+              <w:rPr>
+                <w:rFonts w:ascii="Consolas" w:hAnsi="Consolas"/>
+                <w:sz w:val="18"/>
+              </w:rPr>
+              <w:t>* | f9bd79f merge: integrar informe final de evidencias en main</w:t>
+            </w:r>
+          </w:p>
+          <w:p>
+            <w:r>
+              <w:rPr>
+                <w:rFonts w:ascii="Consolas" w:hAnsi="Consolas"/>
+                <w:sz w:val="18"/>
+              </w:rPr>
+              <w:t xml:space="preserve">|\| </w:t>
+            </w:r>
+          </w:p>
+          <w:p>
+            <w:r>
+              <w:rPr>
+                <w:rFonts w:ascii="Consolas" w:hAnsi="Consolas"/>
+                <w:sz w:val="18"/>
+              </w:rPr>
+              <w:t>| * 66b02e7 docs: agregar informe final en Word con evidencias del flujo de trabajo Git</w:t>
+            </w:r>
+          </w:p>
+          <w:p>
+            <w:r>
+              <w:rPr>
+                <w:rFonts w:ascii="Consolas" w:hAnsi="Consolas"/>
+                <w:sz w:val="18"/>
+              </w:rPr>
+              <w:t>* | ec327f3 merge: integrar documentación de evidencias en main</w:t>
+            </w:r>
+          </w:p>
+          <w:p>
+            <w:r>
+              <w:rPr>
+                <w:rFonts w:ascii="Consolas" w:hAnsi="Consolas"/>
+                <w:sz w:val="18"/>
+              </w:rPr>
+              <w:t xml:space="preserve">|\| </w:t>
             </w:r>
           </w:p>
           <w:p>
@@ -799,7 +902,7 @@
     </w:p>
     <w:p>
       <w:r>
-        <w:t>En este desarrollo, Juan Retuerto implementó los módulos de clientes, productos, pedidos y la integración final (main.py). Para evidenciar la colaboración de un segundo integrante, se simuló la participación de un compañero (María López) mediante una rama independiente que modificó el README.md con su propia información, integrada posteriormente a develop.</w:t>
+        <w:t>En este desarrollo, Juan César Retuerto Ibañez implementó los módulos de clientes, productos, pedidos y la integración final (main.py). Para evidenciar la colaboración del segundo integrante, se simuló la participación de Alberto Joel Ramirez Ponte mediante una rama independiente que modificó el README.md con su propia información, integrada posteriormente a develop.</w:t>
       </w:r>
     </w:p>
     <w:p>
@@ -936,7 +1039,7 @@
                 <w:rFonts w:ascii="Consolas" w:hAnsi="Consolas"/>
                 <w:sz w:val="18"/>
               </w:rPr>
-              <w:t>- Juan Retuerto (U23208480)</w:t>
+              <w:t>- Juan César Retuerto Ibañez (U23208480)</w:t>
             </w:r>
           </w:p>
           <w:p>
@@ -954,7 +1057,7 @@
                 <w:rFonts w:ascii="Consolas" w:hAnsi="Consolas"/>
                 <w:sz w:val="18"/>
               </w:rPr>
-              <w:t>- Juan Retuerto (U23208480) - Módulos: clientes, productos, pedidos, integración</w:t>
+              <w:t>- Juan César Retuerto Ibañez (U23208480) - Módulos: clientes, productos, pedidos, integración</w:t>
             </w:r>
           </w:p>
           <w:p>
@@ -972,7 +1075,7 @@
                 <w:rFonts w:ascii="Consolas" w:hAnsi="Consolas"/>
                 <w:sz w:val="18"/>
               </w:rPr>
-              <w:t>- María López (U23208481) - Módulos: documentación y pruebas</w:t>
+              <w:t>- Alberto Joel Ramirez Ponte (U23249035) - Módulos: documentación y pruebas</w:t>
             </w:r>
           </w:p>
           <w:p>
@@ -1024,7 +1127,7 @@
                 <w:rFonts w:ascii="Consolas" w:hAnsi="Consolas"/>
                 <w:sz w:val="18"/>
               </w:rPr>
-              <w:t>- Juan Retuerto (U23208480) - Módulos: clientes, productos, pedidos, integración</w:t>
+              <w:t>- Juan César Retuerto Ibañez (U23208480) - Módulos: clientes, productos, pedidos, integración</w:t>
             </w:r>
           </w:p>
           <w:p>
@@ -1033,7 +1136,7 @@
                 <w:rFonts w:ascii="Consolas" w:hAnsi="Consolas"/>
                 <w:sz w:val="18"/>
               </w:rPr>
-              <w:t>- María López (U23208481) - Módulos: documentación y pruebas</w:t>
+              <w:t>- Alberto Joel Ramirez Ponte (U23249035) - Módulos: documentación y pruebas</w:t>
             </w:r>
           </w:p>
         </w:tc>
@@ -1124,7 +1227,7 @@
                 <w:rFonts w:ascii="Consolas" w:hAnsi="Consolas"/>
                 <w:sz w:val="18"/>
               </w:rPr>
-              <w:t>git clone https://github.com/&lt;usuario-o-equipo&gt;/proyecto-pedidos-equipo01.git</w:t>
+              <w:t>git clone https://github.com/U23208480/proyecto-pedidos-equipo01.git</w:t>
             </w:r>
           </w:p>
           <w:p>

</xml_diff>